<commit_message>
Bruce: Restored Executive Summary, Critical Actions, and Missing Assets Register to report
</commit_message>
<xml_diff>
--- a/dashboard/static/audit-reports/report_Benowa_ELC_2026-05-09.docx
+++ b/dashboard/static/audit-reports/report_Benowa_ELC_2026-05-09.docx
@@ -32,7 +32,7 @@
           <w:color w:val="1F497D"/>
           <w:sz w:val="32"/>
         </w:rPr>
-        <w:t>FLEET SUMMARY</w:t>
+        <w:t>EXECUTIVE SUMMARY</w:t>
       </w:r>
     </w:p>
     <w:p>
@@ -44,10 +44,55 @@
         <w:rPr>
           <w:b/>
         </w:rPr>
-        <w:t>Total Assets Audited:</w:t>
-      </w:r>
-      <w:r>
-        <w:t xml:space="preserve"> 41</w:t>
+        <w:t>Asset Coverage:</w:t>
+      </w:r>
+      <w:r>
+        <w:t xml:space="preserve"> 41 total devices identified.</w:t>
+      </w:r>
+    </w:p>
+    <w:p>
+      <w:pPr>
+        <w:pStyle w:val="ListBullet"/>
+      </w:pPr>
+      <w:r/>
+      <w:r>
+        <w:rPr>
+          <w:b/>
+        </w:rPr>
+        <w:t>Active Inventory:</w:t>
+      </w:r>
+      <w:r>
+        <w:t xml:space="preserve"> 30 devices confirmed operational.</w:t>
+      </w:r>
+    </w:p>
+    <w:p>
+      <w:pPr>
+        <w:pStyle w:val="ListBullet"/>
+      </w:pPr>
+      <w:r/>
+      <w:r>
+        <w:rPr>
+          <w:b/>
+        </w:rPr>
+        <w:t>Flagged Assets:</w:t>
+      </w:r>
+      <w:r>
+        <w:t xml:space="preserve"> 11 devices currently marked missing / ignore.</w:t>
+      </w:r>
+    </w:p>
+    <w:p>
+      <w:pPr>
+        <w:pStyle w:val="ListBullet"/>
+      </w:pPr>
+      <w:r/>
+      <w:r>
+        <w:rPr>
+          <w:b/>
+        </w:rPr>
+        <w:t>Compliance Alerts:</w:t>
+      </w:r>
+      <w:r>
+        <w:t xml:space="preserve"> 7 devices exceed local photo storage limits.</w:t>
       </w:r>
     </w:p>
     <w:p>
@@ -61,7 +106,7 @@
           <w:color w:val="1F497D"/>
           <w:sz w:val="32"/>
         </w:rPr>
-        <w:t>DETAILED DEVICE AUDIT LOGS</w:t>
+        <w:t>CRITICAL INCIDENTS &amp; IMMEDIATE ACTIONS</w:t>
       </w:r>
     </w:p>
     <w:p>
@@ -74,6 +119,316 @@
           <w:color w:val="1F497D"/>
           <w:sz w:val="26"/>
         </w:rPr>
+        <w:t>Assets Requiring Immediate Investigation</w:t>
+      </w:r>
+    </w:p>
+    <w:p>
+      <w:pPr>
+        <w:pStyle w:val="ListBullet"/>
+      </w:pPr>
+      <w:r/>
+      <w:r>
+        <w:rPr>
+          <w:b/>
+        </w:rPr>
+        <w:t>MISSING:</w:t>
+      </w:r>
+      <w:r>
+        <w:t xml:space="preserve"> Room: Toddlers Two | SN: R9TR70w88cr | Model: Samsung  Galaxy Tab A7 SM-T500</w:t>
+      </w:r>
+    </w:p>
+    <w:p>
+      <w:pPr>
+        <w:pStyle w:val="ListBullet"/>
+      </w:pPr>
+      <w:r/>
+      <w:r>
+        <w:rPr>
+          <w:b/>
+        </w:rPr>
+        <w:t>MISSING:</w:t>
+      </w:r>
+      <w:r>
+        <w:t xml:space="preserve"> Room: Toddlers One | SN: GV3XHHC4CH | Model: Apple 9th Gen MK2K3X/A</w:t>
+      </w:r>
+    </w:p>
+    <w:p>
+      <w:pPr>
+        <w:pStyle w:val="ListBullet"/>
+      </w:pPr>
+      <w:r/>
+      <w:r>
+        <w:rPr>
+          <w:b/>
+        </w:rPr>
+        <w:t>MISSING:</w:t>
+      </w:r>
+      <w:r>
+        <w:t xml:space="preserve"> Room: Kitchen | SN: R9YT10FE&lt;VJ | Model: Samsung  Galaxy Tab A8 SM-X200</w:t>
+      </w:r>
+    </w:p>
+    <w:p>
+      <w:pPr>
+        <w:pStyle w:val="ListBullet"/>
+      </w:pPr>
+      <w:r/>
+      <w:r>
+        <w:rPr>
+          <w:b/>
+        </w:rPr>
+        <w:t>MISSING:</w:t>
+      </w:r>
+      <w:r>
+        <w:t xml:space="preserve"> Room: Kindy Two | SN: R9TR70W810E | Model: Samsung  Galaxy Tab A7 SM-T500</w:t>
+      </w:r>
+    </w:p>
+    <w:p>
+      <w:pPr>
+        <w:pStyle w:val="ListBullet"/>
+      </w:pPr>
+      <w:r/>
+      <w:r>
+        <w:rPr>
+          <w:b/>
+        </w:rPr>
+        <w:t>MISSING:</w:t>
+      </w:r>
+      <w:r>
+        <w:t xml:space="preserve"> Room: BELC Gym Music | SN: F69YR6WW0L | Model: Apple A16</w:t>
+      </w:r>
+    </w:p>
+    <w:p>
+      <w:pPr>
+        <w:pStyle w:val="ListBullet"/>
+      </w:pPr>
+      <w:r/>
+      <w:r>
+        <w:rPr>
+          <w:b/>
+        </w:rPr>
+        <w:t>MISSING:</w:t>
+      </w:r>
+      <w:r>
+        <w:t xml:space="preserve"> Room: Babies Two | SN: R9TR80A8TBB | Model: Samsung  Galaxy Tab A7 SM-T500</w:t>
+      </w:r>
+    </w:p>
+    <w:p>
+      <w:pPr>
+        <w:pStyle w:val="ListBullet"/>
+      </w:pPr>
+      <w:r/>
+      <w:r>
+        <w:rPr>
+          <w:b/>
+        </w:rPr>
+        <w:t>MISSING:</w:t>
+      </w:r>
+      <w:r>
+        <w:t xml:space="preserve"> Room: Xplor Signin OSHC | SN: MW454V2HDH | Model: Apple 9th Gen MK2K3X/A</w:t>
+      </w:r>
+    </w:p>
+    <w:p>
+      <w:pPr>
+        <w:pStyle w:val="ListBullet"/>
+      </w:pPr>
+      <w:r/>
+      <w:r>
+        <w:rPr>
+          <w:b/>
+        </w:rPr>
+        <w:t>MISSING:</w:t>
+      </w:r>
+      <w:r>
+        <w:t xml:space="preserve"> Room: Simona | SN: DDP2QXF6H9 | Model: Iphone 14 Pro Max</w:t>
+      </w:r>
+    </w:p>
+    <w:p>
+      <w:pPr>
+        <w:pStyle w:val="ListBullet"/>
+      </w:pPr>
+      <w:r/>
+      <w:r>
+        <w:rPr>
+          <w:b/>
+        </w:rPr>
+        <w:t>MISSING:</w:t>
+      </w:r>
+      <w:r>
+        <w:t xml:space="preserve"> Room: Russell | SN: JD9JqDPX4L | Model: Iphone 15 MTP03ZP/A</w:t>
+      </w:r>
+    </w:p>
+    <w:p>
+      <w:pPr>
+        <w:pStyle w:val="ListBullet"/>
+      </w:pPr>
+      <w:r/>
+      <w:r>
+        <w:rPr>
+          <w:b/>
+        </w:rPr>
+        <w:t>MISSING:</w:t>
+      </w:r>
+      <w:r>
+        <w:t xml:space="preserve"> Room: Kylie | SN: TV39PR9WI9 | Model: IPhone 14 Pro Max</w:t>
+      </w:r>
+    </w:p>
+    <w:p>
+      <w:pPr>
+        <w:pStyle w:val="ListBullet"/>
+      </w:pPr>
+      <w:r/>
+      <w:r>
+        <w:rPr>
+          <w:b/>
+        </w:rPr>
+        <w:t>MISSING:</w:t>
+      </w:r>
+      <w:r>
+        <w:t xml:space="preserve"> Room: Kate | SN: LF2LRW53QW | Model: Iphone 13 MLPF3X/A</w:t>
+      </w:r>
+    </w:p>
+    <w:p>
+      <w:pPr>
+        <w:pStyle w:val="Heading2"/>
+      </w:pPr>
+      <w:r>
+        <w:rPr>
+          <w:rFonts w:ascii="Arial" w:hAnsi="Arial"/>
+          <w:color w:val="1F497D"/>
+          <w:sz w:val="26"/>
+        </w:rPr>
+        <w:t>Photo Retention Breaches</w:t>
+      </w:r>
+    </w:p>
+    <w:p>
+      <w:pPr>
+        <w:pStyle w:val="ListBullet"/>
+      </w:pPr>
+      <w:r/>
+      <w:r>
+        <w:rPr>
+          <w:b/>
+        </w:rPr>
+        <w:t>PRIVACY:</w:t>
+      </w:r>
+      <w:r>
+        <w:t xml:space="preserve"> Room: Toddlers Two | SN: LJ95R2P759 | Count: 237 Photos</w:t>
+      </w:r>
+    </w:p>
+    <w:p>
+      <w:pPr>
+        <w:pStyle w:val="ListBullet"/>
+      </w:pPr>
+      <w:r/>
+      <w:r>
+        <w:rPr>
+          <w:b/>
+        </w:rPr>
+        <w:t>PRIVACY:</w:t>
+      </w:r>
+      <w:r>
+        <w:t xml:space="preserve"> Room: Senior Kindy | SN: W5VJ6EJF4M | Count: 872 Photos</w:t>
+      </w:r>
+    </w:p>
+    <w:p>
+      <w:pPr>
+        <w:pStyle w:val="ListBullet"/>
+      </w:pPr>
+      <w:r/>
+      <w:r>
+        <w:rPr>
+          <w:b/>
+        </w:rPr>
+        <w:t>PRIVACY:</w:t>
+      </w:r>
+      <w:r>
+        <w:t xml:space="preserve"> Room: Pre Kindy | SN: YH4VWHXJ2N | Count: 477 Photos</w:t>
+      </w:r>
+    </w:p>
+    <w:p>
+      <w:pPr>
+        <w:pStyle w:val="ListBullet"/>
+      </w:pPr>
+      <w:r/>
+      <w:r>
+        <w:rPr>
+          <w:b/>
+        </w:rPr>
+        <w:t>PRIVACY:</w:t>
+      </w:r>
+      <w:r>
+        <w:t xml:space="preserve"> Room: Kindy Two | SN: MCPF3X11J9 | Count: 670 Photos</w:t>
+      </w:r>
+    </w:p>
+    <w:p>
+      <w:pPr>
+        <w:pStyle w:val="ListBullet"/>
+      </w:pPr>
+      <w:r/>
+      <w:r>
+        <w:rPr>
+          <w:b/>
+        </w:rPr>
+        <w:t>PRIVACY:</w:t>
+      </w:r>
+      <w:r>
+        <w:t xml:space="preserve"> Room: Kindy One | SN: X9RQGD1QWM | Count: 924 Photos</w:t>
+      </w:r>
+    </w:p>
+    <w:p>
+      <w:pPr>
+        <w:pStyle w:val="ListBullet"/>
+      </w:pPr>
+      <w:r/>
+      <w:r>
+        <w:rPr>
+          <w:b/>
+        </w:rPr>
+        <w:t>PRIVACY:</w:t>
+      </w:r>
+      <w:r>
+        <w:t xml:space="preserve"> Room: Babies Two | SN: XR7R42YN3H | Count: 1394 Photos</w:t>
+      </w:r>
+    </w:p>
+    <w:p>
+      <w:pPr>
+        <w:pStyle w:val="ListBullet"/>
+      </w:pPr>
+      <w:r/>
+      <w:r>
+        <w:rPr>
+          <w:b/>
+        </w:rPr>
+        <w:t>PRIVACY:</w:t>
+      </w:r>
+      <w:r>
+        <w:t xml:space="preserve"> Room: OSHC | SN: KN2Y3Q2RTY | Count: 256 Photos</w:t>
+      </w:r>
+    </w:p>
+    <w:p>
+      <w:pPr>
+        <w:pStyle w:val="Heading1"/>
+      </w:pPr>
+      <w:r>
+        <w:rPr>
+          <w:rFonts w:ascii="Arial" w:hAnsi="Arial"/>
+          <w:b/>
+          <w:color w:val="1F497D"/>
+          <w:sz w:val="32"/>
+        </w:rPr>
+        <w:t>DETAILED AUDIT FINDINGS BY ROOM / USER</w:t>
+      </w:r>
+    </w:p>
+    <w:p>
+      <w:pPr>
+        <w:pStyle w:val="Heading2"/>
+      </w:pPr>
+      <w:r>
+        <w:rPr>
+          <w:rFonts w:ascii="Arial" w:hAnsi="Arial"/>
+          <w:color w:val="1F497D"/>
+          <w:sz w:val="26"/>
+        </w:rPr>
         <w:t>Room: None</w:t>
       </w:r>
     </w:p>
@@ -107,7 +462,7 @@
         <w:rPr>
           <w:b/>
         </w:rPr>
-        <w:t>OS:</w:t>
+        <w:t>OS Version:</w:t>
       </w:r>
       <w:r>
         <w:t xml:space="preserve"> Windows 11</w:t>
@@ -125,7 +480,7 @@
         <w:t>Compliance:</w:t>
       </w:r>
       <w:r>
-        <w:t xml:space="preserve"> Updates: yes | Security: yes</w:t>
+        <w:t xml:space="preserve"> Updates: yes | Security Check: yes</w:t>
       </w:r>
     </w:p>
     <w:p>
@@ -137,7 +492,7 @@
         <w:rPr>
           <w:b/>
         </w:rPr>
-        <w:t>Notes:</w:t>
+        <w:t>Engineer Notes:</w:t>
       </w:r>
       <w:r>
         <w:t xml:space="preserve"> notes of issues</w:t>
@@ -186,10 +541,10 @@
         <w:rPr>
           <w:b/>
         </w:rPr>
-        <w:t>OS:</w:t>
-      </w:r>
-      <w:r>
-        <w:t xml:space="preserve"> iOS Latest</w:t>
+        <w:t>OS Version:</w:t>
+      </w:r>
+      <w:r>
+        <w:t xml:space="preserve"> iOS N/A</w:t>
       </w:r>
     </w:p>
     <w:p>
@@ -201,10 +556,10 @@
         <w:rPr>
           <w:b/>
         </w:rPr>
-        <w:t>Media:</w:t>
-      </w:r>
-      <w:r>
-        <w:t xml:space="preserve"> 0 Photos | Date: N/A</w:t>
+        <w:t>Cloud Sync:</w:t>
+      </w:r>
+      <w:r>
+        <w:t xml:space="preserve"> Camera: ON (Check) | OneDrive: ON (Pass)</w:t>
       </w:r>
     </w:p>
     <w:p>
@@ -216,10 +571,10 @@
         <w:rPr>
           <w:b/>
         </w:rPr>
-        <w:t>Sync:</w:t>
-      </w:r>
-      <w:r>
-        <w:t xml:space="preserve"> Camera Sync Off: No | OneDrive: Yes</w:t>
+        <w:t>Photos:</w:t>
+      </w:r>
+      <w:r>
+        <w:t xml:space="preserve"> 0 files recorded on N/A</w:t>
       </w:r>
     </w:p>
     <w:p>
@@ -231,7 +586,7 @@
         <w:rPr>
           <w:b/>
         </w:rPr>
-        <w:t>Notes:</w:t>
+        <w:t>Engineer Notes:</w:t>
       </w:r>
       <w:r>
         <w:t xml:space="preserve"> test</w:t>
@@ -280,10 +635,10 @@
         <w:rPr>
           <w:b/>
         </w:rPr>
-        <w:t>OS:</w:t>
-      </w:r>
-      <w:r>
-        <w:t xml:space="preserve"> iOS Latest</w:t>
+        <w:t>OS Version:</w:t>
+      </w:r>
+      <w:r>
+        <w:t xml:space="preserve"> iOS N/A</w:t>
       </w:r>
     </w:p>
     <w:p>
@@ -295,10 +650,10 @@
         <w:rPr>
           <w:b/>
         </w:rPr>
-        <w:t>Media:</w:t>
-      </w:r>
-      <w:r>
-        <w:t xml:space="preserve"> 0 Photos | Date: N/A</w:t>
+        <w:t>Cloud Sync:</w:t>
+      </w:r>
+      <w:r>
+        <w:t xml:space="preserve"> Camera: OFF (Pass) | OneDrive: ON (Pass)</w:t>
       </w:r>
     </w:p>
     <w:p>
@@ -310,10 +665,10 @@
         <w:rPr>
           <w:b/>
         </w:rPr>
-        <w:t>Sync:</w:t>
-      </w:r>
-      <w:r>
-        <w:t xml:space="preserve"> Camera Sync Off: Yes | OneDrive: Yes</w:t>
+        <w:t>Photos:</w:t>
+      </w:r>
+      <w:r>
+        <w:t xml:space="preserve"> 0 files recorded on N/A</w:t>
       </w:r>
     </w:p>
     <w:p>
@@ -325,7 +680,7 @@
         <w:rPr>
           <w:b/>
         </w:rPr>
-        <w:t>Notes:</w:t>
+        <w:t>Engineer Notes:</w:t>
       </w:r>
       <w:r>
         <w:t xml:space="preserve"> Active</w:t>
@@ -374,7 +729,7 @@
         <w:rPr>
           <w:b/>
         </w:rPr>
-        <w:t>OS:</w:t>
+        <w:t>OS Version:</w:t>
       </w:r>
       <w:r>
         <w:t xml:space="preserve"> Windows 11</w:t>
@@ -392,7 +747,7 @@
         <w:t>Compliance:</w:t>
       </w:r>
       <w:r>
-        <w:t xml:space="preserve"> Updates: N/A | Security: Passed</w:t>
+        <w:t xml:space="preserve"> Updates: N/A | Security Check: Passed</w:t>
       </w:r>
     </w:p>
     <w:p>
@@ -404,7 +759,7 @@
         <w:rPr>
           <w:b/>
         </w:rPr>
-        <w:t>Notes:</w:t>
+        <w:t>Engineer Notes:</w:t>
       </w:r>
       <w:r>
         <w:t xml:space="preserve"> Active - Validated</w:t>
@@ -453,10 +808,10 @@
         <w:rPr>
           <w:b/>
         </w:rPr>
-        <w:t>OS:</w:t>
-      </w:r>
-      <w:r>
-        <w:t xml:space="preserve"> iOS Latest</w:t>
+        <w:t>OS Version:</w:t>
+      </w:r>
+      <w:r>
+        <w:t xml:space="preserve"> iOS N/A</w:t>
       </w:r>
     </w:p>
     <w:p>
@@ -468,10 +823,10 @@
         <w:rPr>
           <w:b/>
         </w:rPr>
-        <w:t>Media:</w:t>
-      </w:r>
-      <w:r>
-        <w:t xml:space="preserve"> 0 Photos | Date: N/A</w:t>
+        <w:t>Cloud Sync:</w:t>
+      </w:r>
+      <w:r>
+        <w:t xml:space="preserve"> Camera: OFF (Pass) | OneDrive: ON (Pass)</w:t>
       </w:r>
     </w:p>
     <w:p>
@@ -483,10 +838,10 @@
         <w:rPr>
           <w:b/>
         </w:rPr>
-        <w:t>Sync:</w:t>
-      </w:r>
-      <w:r>
-        <w:t xml:space="preserve"> Camera Sync Off: Yes | OneDrive: Yes</w:t>
+        <w:t>Photos:</w:t>
+      </w:r>
+      <w:r>
+        <w:t xml:space="preserve"> 0 files recorded on N/A</w:t>
       </w:r>
     </w:p>
     <w:p>
@@ -498,7 +853,7 @@
         <w:rPr>
           <w:b/>
         </w:rPr>
-        <w:t>Notes:</w:t>
+        <w:t>Engineer Notes:</w:t>
       </w:r>
       <w:r>
         <w:t xml:space="preserve"> REQUIRED ACTION: Locate / verify</w:t>
@@ -547,7 +902,7 @@
         <w:rPr>
           <w:b/>
         </w:rPr>
-        <w:t>OS:</w:t>
+        <w:t>OS Version:</w:t>
       </w:r>
       <w:r>
         <w:t xml:space="preserve"> iOS yes</w:t>
@@ -562,10 +917,10 @@
         <w:rPr>
           <w:b/>
         </w:rPr>
-        <w:t>Media:</w:t>
-      </w:r>
-      <w:r>
-        <w:t xml:space="preserve"> 1394 Photos | Date: 2026-04-01</w:t>
+        <w:t>Cloud Sync:</w:t>
+      </w:r>
+      <w:r>
+        <w:t xml:space="preserve"> Camera: OFF (Pass) | OneDrive: ON (Pass)</w:t>
       </w:r>
     </w:p>
     <w:p>
@@ -577,10 +932,10 @@
         <w:rPr>
           <w:b/>
         </w:rPr>
-        <w:t>Sync:</w:t>
-      </w:r>
-      <w:r>
-        <w:t xml:space="preserve"> Camera Sync Off: Yes | OneDrive: Yes</w:t>
+        <w:t>Photos:</w:t>
+      </w:r>
+      <w:r>
+        <w:t xml:space="preserve"> 1394 files recorded on 2026-04-01</w:t>
       </w:r>
     </w:p>
     <w:p>
@@ -592,7 +947,7 @@
         <w:rPr>
           <w:b/>
         </w:rPr>
-        <w:t>Notes:</w:t>
+        <w:t>Engineer Notes:</w:t>
       </w:r>
       <w:r>
         <w:t xml:space="preserve"> Active / photo reduction required</w:t>
@@ -641,7 +996,7 @@
         <w:rPr>
           <w:b/>
         </w:rPr>
-        <w:t>OS:</w:t>
+        <w:t>OS Version:</w:t>
       </w:r>
       <w:r>
         <w:t xml:space="preserve"> Windows 11</w:t>
@@ -659,7 +1014,7 @@
         <w:t>Compliance:</w:t>
       </w:r>
       <w:r>
-        <w:t xml:space="preserve"> Updates: N/A | Security: Passed</w:t>
+        <w:t xml:space="preserve"> Updates: N/A | Security Check: Passed</w:t>
       </w:r>
     </w:p>
     <w:p>
@@ -671,7 +1026,7 @@
         <w:rPr>
           <w:b/>
         </w:rPr>
-        <w:t>Notes:</w:t>
+        <w:t>Engineer Notes:</w:t>
       </w:r>
       <w:r>
         <w:t xml:space="preserve"> Active - Validated</w:t>
@@ -720,10 +1075,10 @@
         <w:rPr>
           <w:b/>
         </w:rPr>
-        <w:t>OS:</w:t>
-      </w:r>
-      <w:r>
-        <w:t xml:space="preserve"> iOS Latest</w:t>
+        <w:t>OS Version:</w:t>
+      </w:r>
+      <w:r>
+        <w:t xml:space="preserve"> iOS N/A</w:t>
       </w:r>
     </w:p>
     <w:p>
@@ -735,10 +1090,10 @@
         <w:rPr>
           <w:b/>
         </w:rPr>
-        <w:t>Media:</w:t>
-      </w:r>
-      <w:r>
-        <w:t xml:space="preserve"> 0 Photos | Date: N/A</w:t>
+        <w:t>Cloud Sync:</w:t>
+      </w:r>
+      <w:r>
+        <w:t xml:space="preserve"> Camera: OFF (Pass) | OneDrive: ON (Pass)</w:t>
       </w:r>
     </w:p>
     <w:p>
@@ -750,10 +1105,10 @@
         <w:rPr>
           <w:b/>
         </w:rPr>
-        <w:t>Sync:</w:t>
-      </w:r>
-      <w:r>
-        <w:t xml:space="preserve"> Camera Sync Off: Yes | OneDrive: Yes</w:t>
+        <w:t>Photos:</w:t>
+      </w:r>
+      <w:r>
+        <w:t xml:space="preserve"> 0 files recorded on N/A</w:t>
       </w:r>
     </w:p>
     <w:p>
@@ -765,7 +1120,7 @@
         <w:rPr>
           <w:b/>
         </w:rPr>
-        <w:t>Notes:</w:t>
+        <w:t>Engineer Notes:</w:t>
       </w:r>
       <w:r>
         <w:t xml:space="preserve"> REQUIRED ACTION: Locate / verify</w:t>
@@ -814,7 +1169,7 @@
         <w:rPr>
           <w:b/>
         </w:rPr>
-        <w:t>OS:</w:t>
+        <w:t>OS Version:</w:t>
       </w:r>
       <w:r>
         <w:t xml:space="preserve"> Windows 10/11</w:t>
@@ -832,7 +1187,7 @@
         <w:t>Compliance:</w:t>
       </w:r>
       <w:r>
-        <w:t xml:space="preserve"> Updates: N/A | Security: Passed</w:t>
+        <w:t xml:space="preserve"> Updates: N/A | Security Check: Passed</w:t>
       </w:r>
     </w:p>
     <w:p>
@@ -844,7 +1199,7 @@
         <w:rPr>
           <w:b/>
         </w:rPr>
-        <w:t>Notes:</w:t>
+        <w:t>Engineer Notes:</w:t>
       </w:r>
       <w:r>
         <w:t xml:space="preserve"> Admin Master</w:t>
@@ -893,7 +1248,7 @@
         <w:rPr>
           <w:b/>
         </w:rPr>
-        <w:t>OS:</w:t>
+        <w:t>OS Version:</w:t>
       </w:r>
       <w:r>
         <w:t xml:space="preserve"> Windows N/A</w:t>
@@ -911,7 +1266,7 @@
         <w:t>Compliance:</w:t>
       </w:r>
       <w:r>
-        <w:t xml:space="preserve"> Updates: N/A | Security: N/A</w:t>
+        <w:t xml:space="preserve"> Updates: N/A | Security Check: N/A</w:t>
       </w:r>
     </w:p>
     <w:p>
@@ -923,7 +1278,7 @@
         <w:rPr>
           <w:b/>
         </w:rPr>
-        <w:t>Notes:</w:t>
+        <w:t>Engineer Notes:</w:t>
       </w:r>
       <w:r>
         <w:t xml:space="preserve"> Bulk Import</w:t>
@@ -972,10 +1327,10 @@
         <w:rPr>
           <w:b/>
         </w:rPr>
-        <w:t>OS:</w:t>
-      </w:r>
-      <w:r>
-        <w:t xml:space="preserve"> iOS Latest</w:t>
+        <w:t>OS Version:</w:t>
+      </w:r>
+      <w:r>
+        <w:t xml:space="preserve"> iOS N/A</w:t>
       </w:r>
     </w:p>
     <w:p>
@@ -987,10 +1342,10 @@
         <w:rPr>
           <w:b/>
         </w:rPr>
-        <w:t>Media:</w:t>
-      </w:r>
-      <w:r>
-        <w:t xml:space="preserve"> 0 Photos | Date: N/A</w:t>
+        <w:t>Cloud Sync:</w:t>
+      </w:r>
+      <w:r>
+        <w:t xml:space="preserve"> Camera: OFF (Pass) | OneDrive: ON (Pass)</w:t>
       </w:r>
     </w:p>
     <w:p>
@@ -1002,10 +1357,10 @@
         <w:rPr>
           <w:b/>
         </w:rPr>
-        <w:t>Sync:</w:t>
-      </w:r>
-      <w:r>
-        <w:t xml:space="preserve"> Camera Sync Off: Yes | OneDrive: Yes</w:t>
+        <w:t>Photos:</w:t>
+      </w:r>
+      <w:r>
+        <w:t xml:space="preserve"> 0 files recorded on N/A</w:t>
       </w:r>
     </w:p>
     <w:p>
@@ -1017,7 +1372,7 @@
         <w:rPr>
           <w:b/>
         </w:rPr>
-        <w:t>Notes:</w:t>
+        <w:t>Engineer Notes:</w:t>
       </w:r>
       <w:r>
         <w:t xml:space="preserve"> REQUIRED ACTION: Locate / verify</w:t>
@@ -1066,7 +1421,7 @@
         <w:rPr>
           <w:b/>
         </w:rPr>
-        <w:t>OS:</w:t>
+        <w:t>OS Version:</w:t>
       </w:r>
       <w:r>
         <w:t xml:space="preserve"> Windows 11</w:t>
@@ -1084,7 +1439,7 @@
         <w:t>Compliance:</w:t>
       </w:r>
       <w:r>
-        <w:t xml:space="preserve"> Updates: N/A | Security: Passed</w:t>
+        <w:t xml:space="preserve"> Updates: N/A | Security Check: Passed</w:t>
       </w:r>
     </w:p>
     <w:p>
@@ -1096,7 +1451,7 @@
         <w:rPr>
           <w:b/>
         </w:rPr>
-        <w:t>Notes:</w:t>
+        <w:t>Engineer Notes:</w:t>
       </w:r>
       <w:r>
         <w:t xml:space="preserve"> Active - Validated</w:t>
@@ -1145,7 +1500,7 @@
         <w:rPr>
           <w:b/>
         </w:rPr>
-        <w:t>OS:</w:t>
+        <w:t>OS Version:</w:t>
       </w:r>
       <w:r>
         <w:t xml:space="preserve"> Windows 11</w:t>
@@ -1163,7 +1518,7 @@
         <w:t>Compliance:</w:t>
       </w:r>
       <w:r>
-        <w:t xml:space="preserve"> Updates: N/A | Security: Passed</w:t>
+        <w:t xml:space="preserve"> Updates: N/A | Security Check: Passed</w:t>
       </w:r>
     </w:p>
     <w:p>
@@ -1175,7 +1530,7 @@
         <w:rPr>
           <w:b/>
         </w:rPr>
-        <w:t>Notes:</w:t>
+        <w:t>Engineer Notes:</w:t>
       </w:r>
       <w:r>
         <w:t xml:space="preserve"> Active - Validated</w:t>
@@ -1224,7 +1579,7 @@
         <w:rPr>
           <w:b/>
         </w:rPr>
-        <w:t>OS:</w:t>
+        <w:t>OS Version:</w:t>
       </w:r>
       <w:r>
         <w:t xml:space="preserve"> Windows N/A</w:t>
@@ -1242,7 +1597,7 @@
         <w:t>Compliance:</w:t>
       </w:r>
       <w:r>
-        <w:t xml:space="preserve"> Updates: N/A | Security: N/A</w:t>
+        <w:t xml:space="preserve"> Updates: N/A | Security Check: N/A</w:t>
       </w:r>
     </w:p>
     <w:p>
@@ -1254,7 +1609,7 @@
         <w:rPr>
           <w:b/>
         </w:rPr>
-        <w:t>Notes:</w:t>
+        <w:t>Engineer Notes:</w:t>
       </w:r>
       <w:r>
         <w:t xml:space="preserve"> Bulk Import</w:t>
@@ -1303,7 +1658,7 @@
         <w:rPr>
           <w:b/>
         </w:rPr>
-        <w:t>OS:</w:t>
+        <w:t>OS Version:</w:t>
       </w:r>
       <w:r>
         <w:t xml:space="preserve"> iOS yes</w:t>
@@ -1318,10 +1673,10 @@
         <w:rPr>
           <w:b/>
         </w:rPr>
-        <w:t>Media:</w:t>
-      </w:r>
-      <w:r>
-        <w:t xml:space="preserve"> 924 Photos | Date: 2026-04-01</w:t>
+        <w:t>Cloud Sync:</w:t>
+      </w:r>
+      <w:r>
+        <w:t xml:space="preserve"> Camera: OFF (Pass) | OneDrive: ON (Pass)</w:t>
       </w:r>
     </w:p>
     <w:p>
@@ -1333,10 +1688,10 @@
         <w:rPr>
           <w:b/>
         </w:rPr>
-        <w:t>Sync:</w:t>
-      </w:r>
-      <w:r>
-        <w:t xml:space="preserve"> Camera Sync Off: Yes | OneDrive: Yes</w:t>
+        <w:t>Photos:</w:t>
+      </w:r>
+      <w:r>
+        <w:t xml:space="preserve"> 924 files recorded on 2026-04-01</w:t>
       </w:r>
     </w:p>
     <w:p>
@@ -1348,7 +1703,7 @@
         <w:rPr>
           <w:b/>
         </w:rPr>
-        <w:t>Notes:</w:t>
+        <w:t>Engineer Notes:</w:t>
       </w:r>
       <w:r>
         <w:t xml:space="preserve"> Active / photo reduction required</w:t>
@@ -1397,7 +1752,7 @@
         <w:rPr>
           <w:b/>
         </w:rPr>
-        <w:t>OS:</w:t>
+        <w:t>OS Version:</w:t>
       </w:r>
       <w:r>
         <w:t xml:space="preserve"> Windows N/A</w:t>
@@ -1415,7 +1770,7 @@
         <w:t>Compliance:</w:t>
       </w:r>
       <w:r>
-        <w:t xml:space="preserve"> Updates: N/A | Security: N/A</w:t>
+        <w:t xml:space="preserve"> Updates: N/A | Security Check: N/A</w:t>
       </w:r>
     </w:p>
     <w:p>
@@ -1427,7 +1782,7 @@
         <w:rPr>
           <w:b/>
         </w:rPr>
-        <w:t>Notes:</w:t>
+        <w:t>Engineer Notes:</w:t>
       </w:r>
       <w:r>
         <w:t xml:space="preserve"> Bulk Import</w:t>
@@ -1476,10 +1831,10 @@
         <w:rPr>
           <w:b/>
         </w:rPr>
-        <w:t>OS:</w:t>
-      </w:r>
-      <w:r>
-        <w:t xml:space="preserve"> iOS Latest</w:t>
+        <w:t>OS Version:</w:t>
+      </w:r>
+      <w:r>
+        <w:t xml:space="preserve"> iOS N/A</w:t>
       </w:r>
     </w:p>
     <w:p>
@@ -1491,10 +1846,10 @@
         <w:rPr>
           <w:b/>
         </w:rPr>
-        <w:t>Media:</w:t>
-      </w:r>
-      <w:r>
-        <w:t xml:space="preserve"> 670 Photos | Date: 2026-04-01</w:t>
+        <w:t>Cloud Sync:</w:t>
+      </w:r>
+      <w:r>
+        <w:t xml:space="preserve"> Camera: OFF (Pass) | OneDrive: ON (Pass)</w:t>
       </w:r>
     </w:p>
     <w:p>
@@ -1506,10 +1861,10 @@
         <w:rPr>
           <w:b/>
         </w:rPr>
-        <w:t>Sync:</w:t>
-      </w:r>
-      <w:r>
-        <w:t xml:space="preserve"> Camera Sync Off: Yes | OneDrive: Yes</w:t>
+        <w:t>Photos:</w:t>
+      </w:r>
+      <w:r>
+        <w:t xml:space="preserve"> 670 files recorded on 2026-04-01</w:t>
       </w:r>
     </w:p>
     <w:p>
@@ -1521,7 +1876,7 @@
         <w:rPr>
           <w:b/>
         </w:rPr>
-        <w:t>Notes:</w:t>
+        <w:t>Engineer Notes:</w:t>
       </w:r>
       <w:r>
         <w:t xml:space="preserve"> Active / photo reduction required</w:t>
@@ -1570,10 +1925,10 @@
         <w:rPr>
           <w:b/>
         </w:rPr>
-        <w:t>OS:</w:t>
-      </w:r>
-      <w:r>
-        <w:t xml:space="preserve"> iOS Latest</w:t>
+        <w:t>OS Version:</w:t>
+      </w:r>
+      <w:r>
+        <w:t xml:space="preserve"> iOS N/A</w:t>
       </w:r>
     </w:p>
     <w:p>
@@ -1585,10 +1940,10 @@
         <w:rPr>
           <w:b/>
         </w:rPr>
-        <w:t>Media:</w:t>
-      </w:r>
-      <w:r>
-        <w:t xml:space="preserve"> 0 Photos | Date: N/A</w:t>
+        <w:t>Cloud Sync:</w:t>
+      </w:r>
+      <w:r>
+        <w:t xml:space="preserve"> Camera: OFF (Pass) | OneDrive: ON (Pass)</w:t>
       </w:r>
     </w:p>
     <w:p>
@@ -1600,10 +1955,10 @@
         <w:rPr>
           <w:b/>
         </w:rPr>
-        <w:t>Sync:</w:t>
-      </w:r>
-      <w:r>
-        <w:t xml:space="preserve"> Camera Sync Off: Yes | OneDrive: Yes</w:t>
+        <w:t>Photos:</w:t>
+      </w:r>
+      <w:r>
+        <w:t xml:space="preserve"> 0 files recorded on N/A</w:t>
       </w:r>
     </w:p>
     <w:p>
@@ -1615,7 +1970,7 @@
         <w:rPr>
           <w:b/>
         </w:rPr>
-        <w:t>Notes:</w:t>
+        <w:t>Engineer Notes:</w:t>
       </w:r>
       <w:r>
         <w:t xml:space="preserve"> REQUIRED ACTION: Locate / verify</w:t>
@@ -1664,7 +2019,7 @@
         <w:rPr>
           <w:b/>
         </w:rPr>
-        <w:t>OS:</w:t>
+        <w:t>OS Version:</w:t>
       </w:r>
       <w:r>
         <w:t xml:space="preserve"> Windows 11</w:t>
@@ -1682,7 +2037,7 @@
         <w:t>Compliance:</w:t>
       </w:r>
       <w:r>
-        <w:t xml:space="preserve"> Updates: N/A | Security: Passed</w:t>
+        <w:t xml:space="preserve"> Updates: N/A | Security Check: Passed</w:t>
       </w:r>
     </w:p>
     <w:p>
@@ -1694,7 +2049,7 @@
         <w:rPr>
           <w:b/>
         </w:rPr>
-        <w:t>Notes:</w:t>
+        <w:t>Engineer Notes:</w:t>
       </w:r>
       <w:r>
         <w:t xml:space="preserve"> Active - Validated</w:t>
@@ -1743,10 +2098,10 @@
         <w:rPr>
           <w:b/>
         </w:rPr>
-        <w:t>OS:</w:t>
-      </w:r>
-      <w:r>
-        <w:t xml:space="preserve"> iOS Latest</w:t>
+        <w:t>OS Version:</w:t>
+      </w:r>
+      <w:r>
+        <w:t xml:space="preserve"> iOS N/A</w:t>
       </w:r>
     </w:p>
     <w:p>
@@ -1758,10 +2113,10 @@
         <w:rPr>
           <w:b/>
         </w:rPr>
-        <w:t>Media:</w:t>
-      </w:r>
-      <w:r>
-        <w:t xml:space="preserve"> 0 Photos | Date: N/A</w:t>
+        <w:t>Cloud Sync:</w:t>
+      </w:r>
+      <w:r>
+        <w:t xml:space="preserve"> Camera: OFF (Pass) | OneDrive: ON (Pass)</w:t>
       </w:r>
     </w:p>
     <w:p>
@@ -1773,10 +2128,10 @@
         <w:rPr>
           <w:b/>
         </w:rPr>
-        <w:t>Sync:</w:t>
-      </w:r>
-      <w:r>
-        <w:t xml:space="preserve"> Camera Sync Off: Yes | OneDrive: Yes</w:t>
+        <w:t>Photos:</w:t>
+      </w:r>
+      <w:r>
+        <w:t xml:space="preserve"> 0 files recorded on N/A</w:t>
       </w:r>
     </w:p>
     <w:p>
@@ -1788,7 +2143,7 @@
         <w:rPr>
           <w:b/>
         </w:rPr>
-        <w:t>Notes:</w:t>
+        <w:t>Engineer Notes:</w:t>
       </w:r>
       <w:r>
         <w:t xml:space="preserve"> REQUIRED ACTION: Locate / verify</w:t>
@@ -1837,10 +2192,10 @@
         <w:rPr>
           <w:b/>
         </w:rPr>
-        <w:t>OS:</w:t>
-      </w:r>
-      <w:r>
-        <w:t xml:space="preserve"> iOS Latest</w:t>
+        <w:t>OS Version:</w:t>
+      </w:r>
+      <w:r>
+        <w:t xml:space="preserve"> iOS N/A</w:t>
       </w:r>
     </w:p>
     <w:p>
@@ -1852,10 +2207,10 @@
         <w:rPr>
           <w:b/>
         </w:rPr>
-        <w:t>Media:</w:t>
-      </w:r>
-      <w:r>
-        <w:t xml:space="preserve"> 0 Photos | Date: N/A</w:t>
+        <w:t>Cloud Sync:</w:t>
+      </w:r>
+      <w:r>
+        <w:t xml:space="preserve"> Camera: OFF (Pass) | OneDrive: ON (Pass)</w:t>
       </w:r>
     </w:p>
     <w:p>
@@ -1867,10 +2222,10 @@
         <w:rPr>
           <w:b/>
         </w:rPr>
-        <w:t>Sync:</w:t>
-      </w:r>
-      <w:r>
-        <w:t xml:space="preserve"> Camera Sync Off: Yes | OneDrive: Yes</w:t>
+        <w:t>Photos:</w:t>
+      </w:r>
+      <w:r>
+        <w:t xml:space="preserve"> 0 files recorded on N/A</w:t>
       </w:r>
     </w:p>
     <w:p>
@@ -1882,7 +2237,7 @@
         <w:rPr>
           <w:b/>
         </w:rPr>
-        <w:t>Notes:</w:t>
+        <w:t>Engineer Notes:</w:t>
       </w:r>
       <w:r>
         <w:t xml:space="preserve"> REQUIRED ACTION: Locate / verify</w:t>
@@ -1931,7 +2286,7 @@
         <w:rPr>
           <w:b/>
         </w:rPr>
-        <w:t>OS:</w:t>
+        <w:t>OS Version:</w:t>
       </w:r>
       <w:r>
         <w:t xml:space="preserve"> Windows 11</w:t>
@@ -1949,7 +2304,7 @@
         <w:t>Compliance:</w:t>
       </w:r>
       <w:r>
-        <w:t xml:space="preserve"> Updates: N/A | Security: Passed</w:t>
+        <w:t xml:space="preserve"> Updates: N/A | Security Check: Passed</w:t>
       </w:r>
     </w:p>
     <w:p>
@@ -1961,7 +2316,7 @@
         <w:rPr>
           <w:b/>
         </w:rPr>
-        <w:t>Notes:</w:t>
+        <w:t>Engineer Notes:</w:t>
       </w:r>
       <w:r>
         <w:t xml:space="preserve"> Active - Validated</w:t>
@@ -2010,7 +2365,7 @@
         <w:rPr>
           <w:b/>
         </w:rPr>
-        <w:t>OS:</w:t>
+        <w:t>OS Version:</w:t>
       </w:r>
       <w:r>
         <w:t xml:space="preserve"> Windows N/A</w:t>
@@ -2028,7 +2383,7 @@
         <w:t>Compliance:</w:t>
       </w:r>
       <w:r>
-        <w:t xml:space="preserve"> Updates: N/A | Security: N/A</w:t>
+        <w:t xml:space="preserve"> Updates: N/A | Security Check: N/A</w:t>
       </w:r>
     </w:p>
     <w:p>
@@ -2040,7 +2395,7 @@
         <w:rPr>
           <w:b/>
         </w:rPr>
-        <w:t>Notes:</w:t>
+        <w:t>Engineer Notes:</w:t>
       </w:r>
       <w:r>
         <w:t xml:space="preserve"> test</w:t>
@@ -2089,7 +2444,7 @@
         <w:rPr>
           <w:b/>
         </w:rPr>
-        <w:t>OS:</w:t>
+        <w:t>OS Version:</w:t>
       </w:r>
       <w:r>
         <w:t xml:space="preserve"> iOS yes</w:t>
@@ -2104,10 +2459,10 @@
         <w:rPr>
           <w:b/>
         </w:rPr>
-        <w:t>Media:</w:t>
-      </w:r>
-      <w:r>
-        <w:t xml:space="preserve"> 256 Photos | Date: 2026-04-01</w:t>
+        <w:t>Cloud Sync:</w:t>
+      </w:r>
+      <w:r>
+        <w:t xml:space="preserve"> Camera: OFF (Pass) | OneDrive: ON (Pass)</w:t>
       </w:r>
     </w:p>
     <w:p>
@@ -2119,10 +2474,10 @@
         <w:rPr>
           <w:b/>
         </w:rPr>
-        <w:t>Sync:</w:t>
-      </w:r>
-      <w:r>
-        <w:t xml:space="preserve"> Camera Sync Off: Yes | OneDrive: Yes</w:t>
+        <w:t>Photos:</w:t>
+      </w:r>
+      <w:r>
+        <w:t xml:space="preserve"> 256 files recorded on 2026-04-01</w:t>
       </w:r>
     </w:p>
     <w:p>
@@ -2134,7 +2489,7 @@
         <w:rPr>
           <w:b/>
         </w:rPr>
-        <w:t>Notes:</w:t>
+        <w:t>Engineer Notes:</w:t>
       </w:r>
       <w:r>
         <w:t xml:space="preserve"> Active / photo reduction required</w:t>
@@ -2183,7 +2538,7 @@
         <w:rPr>
           <w:b/>
         </w:rPr>
-        <w:t>OS:</w:t>
+        <w:t>OS Version:</w:t>
       </w:r>
       <w:r>
         <w:t xml:space="preserve"> Windows N/A</w:t>
@@ -2201,7 +2556,7 @@
         <w:t>Compliance:</w:t>
       </w:r>
       <w:r>
-        <w:t xml:space="preserve"> Updates: N/A | Security: N/A</w:t>
+        <w:t xml:space="preserve"> Updates: N/A | Security Check: N/A</w:t>
       </w:r>
     </w:p>
     <w:p>
@@ -2213,7 +2568,7 @@
         <w:rPr>
           <w:b/>
         </w:rPr>
-        <w:t>Notes:</w:t>
+        <w:t>Engineer Notes:</w:t>
       </w:r>
       <w:r>
         <w:t xml:space="preserve"> Bulk Import</w:t>
@@ -2262,10 +2617,10 @@
         <w:rPr>
           <w:b/>
         </w:rPr>
-        <w:t>OS:</w:t>
-      </w:r>
-      <w:r>
-        <w:t xml:space="preserve"> iOS Latest</w:t>
+        <w:t>OS Version:</w:t>
+      </w:r>
+      <w:r>
+        <w:t xml:space="preserve"> iOS N/A</w:t>
       </w:r>
     </w:p>
     <w:p>
@@ -2277,10 +2632,10 @@
         <w:rPr>
           <w:b/>
         </w:rPr>
-        <w:t>Media:</w:t>
-      </w:r>
-      <w:r>
-        <w:t xml:space="preserve"> 0 Photos | Date: N/A</w:t>
+        <w:t>Cloud Sync:</w:t>
+      </w:r>
+      <w:r>
+        <w:t xml:space="preserve"> Camera: OFF (Pass) | OneDrive: ON (Pass)</w:t>
       </w:r>
     </w:p>
     <w:p>
@@ -2292,10 +2647,10 @@
         <w:rPr>
           <w:b/>
         </w:rPr>
-        <w:t>Sync:</w:t>
-      </w:r>
-      <w:r>
-        <w:t xml:space="preserve"> Camera Sync Off: Yes | OneDrive: Yes</w:t>
+        <w:t>Photos:</w:t>
+      </w:r>
+      <w:r>
+        <w:t xml:space="preserve"> 0 files recorded on N/A</w:t>
       </w:r>
     </w:p>
     <w:p>
@@ -2307,7 +2662,7 @@
         <w:rPr>
           <w:b/>
         </w:rPr>
-        <w:t>Notes:</w:t>
+        <w:t>Engineer Notes:</w:t>
       </w:r>
       <w:r>
         <w:t xml:space="preserve"> Active</w:t>
@@ -2356,7 +2711,7 @@
         <w:rPr>
           <w:b/>
         </w:rPr>
-        <w:t>OS:</w:t>
+        <w:t>OS Version:</w:t>
       </w:r>
       <w:r>
         <w:t xml:space="preserve"> iOS yes</w:t>
@@ -2371,10 +2726,10 @@
         <w:rPr>
           <w:b/>
         </w:rPr>
-        <w:t>Media:</w:t>
-      </w:r>
-      <w:r>
-        <w:t xml:space="preserve"> 477 Photos | Date: 2026-04-01</w:t>
+        <w:t>Cloud Sync:</w:t>
+      </w:r>
+      <w:r>
+        <w:t xml:space="preserve"> Camera: OFF (Pass) | OneDrive: ON (Pass)</w:t>
       </w:r>
     </w:p>
     <w:p>
@@ -2386,10 +2741,10 @@
         <w:rPr>
           <w:b/>
         </w:rPr>
-        <w:t>Sync:</w:t>
-      </w:r>
-      <w:r>
-        <w:t xml:space="preserve"> Camera Sync Off: Yes | OneDrive: Yes</w:t>
+        <w:t>Photos:</w:t>
+      </w:r>
+      <w:r>
+        <w:t xml:space="preserve"> 477 files recorded on 2026-04-01</w:t>
       </w:r>
     </w:p>
     <w:p>
@@ -2401,7 +2756,7 @@
         <w:rPr>
           <w:b/>
         </w:rPr>
-        <w:t>Notes:</w:t>
+        <w:t>Engineer Notes:</w:t>
       </w:r>
       <w:r>
         <w:t xml:space="preserve"> Active / photo reduction required</w:t>
@@ -2450,10 +2805,10 @@
         <w:rPr>
           <w:b/>
         </w:rPr>
-        <w:t>OS:</w:t>
-      </w:r>
-      <w:r>
-        <w:t xml:space="preserve"> iOS Latest</w:t>
+        <w:t>OS Version:</w:t>
+      </w:r>
+      <w:r>
+        <w:t xml:space="preserve"> iOS N/A</w:t>
       </w:r>
     </w:p>
     <w:p>
@@ -2465,10 +2820,10 @@
         <w:rPr>
           <w:b/>
         </w:rPr>
-        <w:t>Media:</w:t>
-      </w:r>
-      <w:r>
-        <w:t xml:space="preserve"> 0 Photos | Date: N/A</w:t>
+        <w:t>Cloud Sync:</w:t>
+      </w:r>
+      <w:r>
+        <w:t xml:space="preserve"> Camera: OFF (Pass) | OneDrive: ON (Pass)</w:t>
       </w:r>
     </w:p>
     <w:p>
@@ -2480,10 +2835,10 @@
         <w:rPr>
           <w:b/>
         </w:rPr>
-        <w:t>Sync:</w:t>
-      </w:r>
-      <w:r>
-        <w:t xml:space="preserve"> Camera Sync Off: Yes | OneDrive: Yes</w:t>
+        <w:t>Photos:</w:t>
+      </w:r>
+      <w:r>
+        <w:t xml:space="preserve"> 0 files recorded on N/A</w:t>
       </w:r>
     </w:p>
     <w:p>
@@ -2495,7 +2850,7 @@
         <w:rPr>
           <w:b/>
         </w:rPr>
-        <w:t>Notes:</w:t>
+        <w:t>Engineer Notes:</w:t>
       </w:r>
       <w:r>
         <w:t xml:space="preserve"> REQUIRED ACTION: Locate / verify</w:t>
@@ -2544,10 +2899,10 @@
         <w:rPr>
           <w:b/>
         </w:rPr>
-        <w:t>OS:</w:t>
-      </w:r>
-      <w:r>
-        <w:t xml:space="preserve"> iOS Latest</w:t>
+        <w:t>OS Version:</w:t>
+      </w:r>
+      <w:r>
+        <w:t xml:space="preserve"> iOS N/A</w:t>
       </w:r>
     </w:p>
     <w:p>
@@ -2559,10 +2914,10 @@
         <w:rPr>
           <w:b/>
         </w:rPr>
-        <w:t>Media:</w:t>
-      </w:r>
-      <w:r>
-        <w:t xml:space="preserve"> 0 Photos | Date: N/A</w:t>
+        <w:t>Cloud Sync:</w:t>
+      </w:r>
+      <w:r>
+        <w:t xml:space="preserve"> Camera: OFF (Pass) | OneDrive: ON (Pass)</w:t>
       </w:r>
     </w:p>
     <w:p>
@@ -2574,10 +2929,10 @@
         <w:rPr>
           <w:b/>
         </w:rPr>
-        <w:t>Sync:</w:t>
-      </w:r>
-      <w:r>
-        <w:t xml:space="preserve"> Camera Sync Off: Yes | OneDrive: Yes</w:t>
+        <w:t>Photos:</w:t>
+      </w:r>
+      <w:r>
+        <w:t xml:space="preserve"> 0 files recorded on N/A</w:t>
       </w:r>
     </w:p>
     <w:p>
@@ -2589,7 +2944,7 @@
         <w:rPr>
           <w:b/>
         </w:rPr>
-        <w:t>Notes:</w:t>
+        <w:t>Engineer Notes:</w:t>
       </w:r>
       <w:r>
         <w:t xml:space="preserve"> Active</w:t>
@@ -2638,7 +2993,7 @@
         <w:rPr>
           <w:b/>
         </w:rPr>
-        <w:t>OS:</w:t>
+        <w:t>OS Version:</w:t>
       </w:r>
       <w:r>
         <w:t xml:space="preserve"> iOS yes</w:t>
@@ -2653,10 +3008,10 @@
         <w:rPr>
           <w:b/>
         </w:rPr>
-        <w:t>Media:</w:t>
-      </w:r>
-      <w:r>
-        <w:t xml:space="preserve"> 872 Photos | Date: 2026-04-01</w:t>
+        <w:t>Cloud Sync:</w:t>
+      </w:r>
+      <w:r>
+        <w:t xml:space="preserve"> Camera: OFF (Pass) | OneDrive: OFF (Action required)</w:t>
       </w:r>
     </w:p>
     <w:p>
@@ -2668,10 +3023,10 @@
         <w:rPr>
           <w:b/>
         </w:rPr>
-        <w:t>Sync:</w:t>
-      </w:r>
-      <w:r>
-        <w:t xml:space="preserve"> Camera Sync Off: Yes | OneDrive: No</w:t>
+        <w:t>Photos:</w:t>
+      </w:r>
+      <w:r>
+        <w:t xml:space="preserve"> 872 files recorded on 2026-04-01</w:t>
       </w:r>
     </w:p>
     <w:p>
@@ -2683,7 +3038,7 @@
         <w:rPr>
           <w:b/>
         </w:rPr>
-        <w:t>Notes:</w:t>
+        <w:t>Engineer Notes:</w:t>
       </w:r>
       <w:r>
         <w:t xml:space="preserve"> Active / remediation required - password fail</w:t>
@@ -2732,7 +3087,7 @@
         <w:rPr>
           <w:b/>
         </w:rPr>
-        <w:t>OS:</w:t>
+        <w:t>OS Version:</w:t>
       </w:r>
       <w:r>
         <w:t xml:space="preserve"> Windows 11</w:t>
@@ -2750,7 +3105,7 @@
         <w:t>Compliance:</w:t>
       </w:r>
       <w:r>
-        <w:t xml:space="preserve"> Updates: N/A | Security: Passed</w:t>
+        <w:t xml:space="preserve"> Updates: N/A | Security Check: Passed</w:t>
       </w:r>
     </w:p>
     <w:p>
@@ -2762,7 +3117,7 @@
         <w:rPr>
           <w:b/>
         </w:rPr>
-        <w:t>Notes:</w:t>
+        <w:t>Engineer Notes:</w:t>
       </w:r>
       <w:r>
         <w:t xml:space="preserve"> Active - Validated</w:t>
@@ -2811,10 +3166,10 @@
         <w:rPr>
           <w:b/>
         </w:rPr>
-        <w:t>OS:</w:t>
-      </w:r>
-      <w:r>
-        <w:t xml:space="preserve"> iOS Latest</w:t>
+        <w:t>OS Version:</w:t>
+      </w:r>
+      <w:r>
+        <w:t xml:space="preserve"> iOS N/A</w:t>
       </w:r>
     </w:p>
     <w:p>
@@ -2826,10 +3181,10 @@
         <w:rPr>
           <w:b/>
         </w:rPr>
-        <w:t>Media:</w:t>
-      </w:r>
-      <w:r>
-        <w:t xml:space="preserve"> 0 Photos | Date: N/A</w:t>
+        <w:t>Cloud Sync:</w:t>
+      </w:r>
+      <w:r>
+        <w:t xml:space="preserve"> Camera: OFF (Pass) | OneDrive: ON (Pass)</w:t>
       </w:r>
     </w:p>
     <w:p>
@@ -2841,10 +3196,10 @@
         <w:rPr>
           <w:b/>
         </w:rPr>
-        <w:t>Sync:</w:t>
-      </w:r>
-      <w:r>
-        <w:t xml:space="preserve"> Camera Sync Off: Yes | OneDrive: Yes</w:t>
+        <w:t>Photos:</w:t>
+      </w:r>
+      <w:r>
+        <w:t xml:space="preserve"> 0 files recorded on N/A</w:t>
       </w:r>
     </w:p>
     <w:p>
@@ -2856,7 +3211,7 @@
         <w:rPr>
           <w:b/>
         </w:rPr>
-        <w:t>Notes:</w:t>
+        <w:t>Engineer Notes:</w:t>
       </w:r>
       <w:r>
         <w:t xml:space="preserve"> REQUIRED ACTION: Locate / verify</w:t>
@@ -2905,7 +3260,7 @@
         <w:rPr>
           <w:b/>
         </w:rPr>
-        <w:t>OS:</w:t>
+        <w:t>OS Version:</w:t>
       </w:r>
       <w:r>
         <w:t xml:space="preserve"> Windows 11</w:t>
@@ -2923,7 +3278,7 @@
         <w:t>Compliance:</w:t>
       </w:r>
       <w:r>
-        <w:t xml:space="preserve"> Updates: N/A | Security: Passed</w:t>
+        <w:t xml:space="preserve"> Updates: N/A | Security Check: Passed</w:t>
       </w:r>
     </w:p>
     <w:p>
@@ -2935,7 +3290,7 @@
         <w:rPr>
           <w:b/>
         </w:rPr>
-        <w:t>Notes:</w:t>
+        <w:t>Engineer Notes:</w:t>
       </w:r>
       <w:r>
         <w:t xml:space="preserve"> Active - Validated</w:t>
@@ -2984,10 +3339,10 @@
         <w:rPr>
           <w:b/>
         </w:rPr>
-        <w:t>OS:</w:t>
-      </w:r>
-      <w:r>
-        <w:t xml:space="preserve"> iOS Latest</w:t>
+        <w:t>OS Version:</w:t>
+      </w:r>
+      <w:r>
+        <w:t xml:space="preserve"> iOS N/A</w:t>
       </w:r>
     </w:p>
     <w:p>
@@ -2999,10 +3354,10 @@
         <w:rPr>
           <w:b/>
         </w:rPr>
-        <w:t>Media:</w:t>
-      </w:r>
-      <w:r>
-        <w:t xml:space="preserve"> 0 Photos | Date: N/A</w:t>
+        <w:t>Cloud Sync:</w:t>
+      </w:r>
+      <w:r>
+        <w:t xml:space="preserve"> Camera: OFF (Pass) | OneDrive: ON (Pass)</w:t>
       </w:r>
     </w:p>
     <w:p>
@@ -3014,10 +3369,10 @@
         <w:rPr>
           <w:b/>
         </w:rPr>
-        <w:t>Sync:</w:t>
-      </w:r>
-      <w:r>
-        <w:t xml:space="preserve"> Camera Sync Off: Yes | OneDrive: Yes</w:t>
+        <w:t>Photos:</w:t>
+      </w:r>
+      <w:r>
+        <w:t xml:space="preserve"> 0 files recorded on N/A</w:t>
       </w:r>
     </w:p>
     <w:p>
@@ -3029,7 +3384,7 @@
         <w:rPr>
           <w:b/>
         </w:rPr>
-        <w:t>Notes:</w:t>
+        <w:t>Engineer Notes:</w:t>
       </w:r>
       <w:r>
         <w:t xml:space="preserve"> REQUIRED ACTION: Locate / verify / privacy review</w:t>
@@ -3078,7 +3433,7 @@
         <w:rPr>
           <w:b/>
         </w:rPr>
-        <w:t>OS:</w:t>
+        <w:t>OS Version:</w:t>
       </w:r>
       <w:r>
         <w:t xml:space="preserve"> Windows 11</w:t>
@@ -3096,7 +3451,7 @@
         <w:t>Compliance:</w:t>
       </w:r>
       <w:r>
-        <w:t xml:space="preserve"> Updates: N/A | Security: Passed</w:t>
+        <w:t xml:space="preserve"> Updates: N/A | Security Check: Passed</w:t>
       </w:r>
     </w:p>
     <w:p>
@@ -3108,7 +3463,7 @@
         <w:rPr>
           <w:b/>
         </w:rPr>
-        <w:t>Notes:</w:t>
+        <w:t>Engineer Notes:</w:t>
       </w:r>
       <w:r>
         <w:t xml:space="preserve"> Active - Validated</w:t>
@@ -3157,10 +3512,10 @@
         <w:rPr>
           <w:b/>
         </w:rPr>
-        <w:t>OS:</w:t>
-      </w:r>
-      <w:r>
-        <w:t xml:space="preserve"> iOS Latest</w:t>
+        <w:t>OS Version:</w:t>
+      </w:r>
+      <w:r>
+        <w:t xml:space="preserve"> iOS N/A</w:t>
       </w:r>
     </w:p>
     <w:p>
@@ -3172,10 +3527,10 @@
         <w:rPr>
           <w:b/>
         </w:rPr>
-        <w:t>Media:</w:t>
-      </w:r>
-      <w:r>
-        <w:t xml:space="preserve"> 0 Photos | Date: N/A</w:t>
+        <w:t>Cloud Sync:</w:t>
+      </w:r>
+      <w:r>
+        <w:t xml:space="preserve"> Camera: OFF (Pass) | OneDrive: ON (Pass)</w:t>
       </w:r>
     </w:p>
     <w:p>
@@ -3187,10 +3542,10 @@
         <w:rPr>
           <w:b/>
         </w:rPr>
-        <w:t>Sync:</w:t>
-      </w:r>
-      <w:r>
-        <w:t xml:space="preserve"> Camera Sync Off: Yes | OneDrive: Yes</w:t>
+        <w:t>Photos:</w:t>
+      </w:r>
+      <w:r>
+        <w:t xml:space="preserve"> 0 files recorded on N/A</w:t>
       </w:r>
     </w:p>
     <w:p>
@@ -3202,7 +3557,7 @@
         <w:rPr>
           <w:b/>
         </w:rPr>
-        <w:t>Notes:</w:t>
+        <w:t>Engineer Notes:</w:t>
       </w:r>
       <w:r>
         <w:t xml:space="preserve"> REQUIRED ACTION: Locate / verify</w:t>
@@ -3251,7 +3606,7 @@
         <w:rPr>
           <w:b/>
         </w:rPr>
-        <w:t>OS:</w:t>
+        <w:t>OS Version:</w:t>
       </w:r>
       <w:r>
         <w:t xml:space="preserve"> iOS yes</w:t>
@@ -3266,10 +3621,10 @@
         <w:rPr>
           <w:b/>
         </w:rPr>
-        <w:t>Media:</w:t>
-      </w:r>
-      <w:r>
-        <w:t xml:space="preserve"> 237 Photos | Date: 2026-04-01</w:t>
+        <w:t>Cloud Sync:</w:t>
+      </w:r>
+      <w:r>
+        <w:t xml:space="preserve"> Camera: OFF (Pass) | OneDrive: ON (Pass)</w:t>
       </w:r>
     </w:p>
     <w:p>
@@ -3281,10 +3636,10 @@
         <w:rPr>
           <w:b/>
         </w:rPr>
-        <w:t>Sync:</w:t>
-      </w:r>
-      <w:r>
-        <w:t xml:space="preserve"> Camera Sync Off: Yes | OneDrive: Yes</w:t>
+        <w:t>Photos:</w:t>
+      </w:r>
+      <w:r>
+        <w:t xml:space="preserve"> 237 files recorded on 2026-04-01</w:t>
       </w:r>
     </w:p>
     <w:p>
@@ -3296,7 +3651,7 @@
         <w:rPr>
           <w:b/>
         </w:rPr>
-        <w:t>Notes:</w:t>
+        <w:t>Engineer Notes:</w:t>
       </w:r>
       <w:r>
         <w:t xml:space="preserve"> Active / photo reduction required</w:t>
@@ -3345,7 +3700,7 @@
         <w:rPr>
           <w:b/>
         </w:rPr>
-        <w:t>OS:</w:t>
+        <w:t>OS Version:</w:t>
       </w:r>
       <w:r>
         <w:t xml:space="preserve"> Windows 11</w:t>
@@ -3363,7 +3718,7 @@
         <w:t>Compliance:</w:t>
       </w:r>
       <w:r>
-        <w:t xml:space="preserve"> Updates: N/A | Security: Passed</w:t>
+        <w:t xml:space="preserve"> Updates: N/A | Security Check: Passed</w:t>
       </w:r>
     </w:p>
     <w:p>
@@ -3375,7 +3730,7 @@
         <w:rPr>
           <w:b/>
         </w:rPr>
-        <w:t>Notes:</w:t>
+        <w:t>Engineer Notes:</w:t>
       </w:r>
       <w:r>
         <w:t xml:space="preserve"> Active - Validated</w:t>
@@ -3424,10 +3779,10 @@
         <w:rPr>
           <w:b/>
         </w:rPr>
-        <w:t>OS:</w:t>
-      </w:r>
-      <w:r>
-        <w:t xml:space="preserve"> iOS Latest</w:t>
+        <w:t>OS Version:</w:t>
+      </w:r>
+      <w:r>
+        <w:t xml:space="preserve"> iOS N/A</w:t>
       </w:r>
     </w:p>
     <w:p>
@@ -3439,10 +3794,10 @@
         <w:rPr>
           <w:b/>
         </w:rPr>
-        <w:t>Media:</w:t>
-      </w:r>
-      <w:r>
-        <w:t xml:space="preserve"> 0 Photos | Date: N/A</w:t>
+        <w:t>Cloud Sync:</w:t>
+      </w:r>
+      <w:r>
+        <w:t xml:space="preserve"> Camera: OFF (Pass) | OneDrive: ON (Pass)</w:t>
       </w:r>
     </w:p>
     <w:p>
@@ -3454,10 +3809,10 @@
         <w:rPr>
           <w:b/>
         </w:rPr>
-        <w:t>Sync:</w:t>
-      </w:r>
-      <w:r>
-        <w:t xml:space="preserve"> Camera Sync Off: Yes | OneDrive: Yes</w:t>
+        <w:t>Photos:</w:t>
+      </w:r>
+      <w:r>
+        <w:t xml:space="preserve"> 0 files recorded on N/A</w:t>
       </w:r>
     </w:p>
     <w:p>
@@ -3469,7 +3824,7 @@
         <w:rPr>
           <w:b/>
         </w:rPr>
-        <w:t>Notes:</w:t>
+        <w:t>Engineer Notes:</w:t>
       </w:r>
       <w:r>
         <w:t xml:space="preserve"> Active</w:t>
@@ -3518,10 +3873,10 @@
         <w:rPr>
           <w:b/>
         </w:rPr>
-        <w:t>OS:</w:t>
-      </w:r>
-      <w:r>
-        <w:t xml:space="preserve"> iOS Latest</w:t>
+        <w:t>OS Version:</w:t>
+      </w:r>
+      <w:r>
+        <w:t xml:space="preserve"> iOS N/A</w:t>
       </w:r>
     </w:p>
     <w:p>
@@ -3533,10 +3888,10 @@
         <w:rPr>
           <w:b/>
         </w:rPr>
-        <w:t>Media:</w:t>
-      </w:r>
-      <w:r>
-        <w:t xml:space="preserve"> 0 Photos | Date: N/A</w:t>
+        <w:t>Cloud Sync:</w:t>
+      </w:r>
+      <w:r>
+        <w:t xml:space="preserve"> Camera: OFF (Pass) | OneDrive: ON (Pass)</w:t>
       </w:r>
     </w:p>
     <w:p>
@@ -3548,10 +3903,10 @@
         <w:rPr>
           <w:b/>
         </w:rPr>
-        <w:t>Sync:</w:t>
-      </w:r>
-      <w:r>
-        <w:t xml:space="preserve"> Camera Sync Off: Yes | OneDrive: Yes</w:t>
+        <w:t>Photos:</w:t>
+      </w:r>
+      <w:r>
+        <w:t xml:space="preserve"> 0 files recorded on N/A</w:t>
       </w:r>
     </w:p>
     <w:p>
@@ -3563,7 +3918,7 @@
         <w:rPr>
           <w:b/>
         </w:rPr>
-        <w:t>Notes:</w:t>
+        <w:t>Engineer Notes:</w:t>
       </w:r>
       <w:r>
         <w:t xml:space="preserve"> Active</w:t>
@@ -3612,10 +3967,10 @@
         <w:rPr>
           <w:b/>
         </w:rPr>
-        <w:t>OS:</w:t>
-      </w:r>
-      <w:r>
-        <w:t xml:space="preserve"> iOS Latest</w:t>
+        <w:t>OS Version:</w:t>
+      </w:r>
+      <w:r>
+        <w:t xml:space="preserve"> iOS N/A</w:t>
       </w:r>
     </w:p>
     <w:p>
@@ -3627,10 +3982,10 @@
         <w:rPr>
           <w:b/>
         </w:rPr>
-        <w:t>Media:</w:t>
-      </w:r>
-      <w:r>
-        <w:t xml:space="preserve"> 0 Photos | Date: N/A</w:t>
+        <w:t>Cloud Sync:</w:t>
+      </w:r>
+      <w:r>
+        <w:t xml:space="preserve"> Camera: OFF (Pass) | OneDrive: ON (Pass)</w:t>
       </w:r>
     </w:p>
     <w:p>
@@ -3642,10 +3997,10 @@
         <w:rPr>
           <w:b/>
         </w:rPr>
-        <w:t>Sync:</w:t>
-      </w:r>
-      <w:r>
-        <w:t xml:space="preserve"> Camera Sync Off: Yes | OneDrive: Yes</w:t>
+        <w:t>Photos:</w:t>
+      </w:r>
+      <w:r>
+        <w:t xml:space="preserve"> 0 files recorded on N/A</w:t>
       </w:r>
     </w:p>
     <w:p>
@@ -3657,10 +4012,189 @@
         <w:rPr>
           <w:b/>
         </w:rPr>
-        <w:t>Notes:</w:t>
+        <w:t>Engineer Notes:</w:t>
       </w:r>
       <w:r>
         <w:t xml:space="preserve"> REQUIRED ACTION: Locate / verify / disable access</w:t>
+      </w:r>
+    </w:p>
+    <w:p>
+      <w:pPr>
+        <w:pStyle w:val="Heading1"/>
+      </w:pPr>
+      <w:r>
+        <w:rPr>
+          <w:rFonts w:ascii="Arial" w:hAnsi="Arial"/>
+          <w:b/>
+          <w:color w:val="1F497D"/>
+          <w:sz w:val="32"/>
+        </w:rPr>
+        <w:t>MISSING ASSETS REGISTER</w:t>
+      </w:r>
+    </w:p>
+    <w:p>
+      <w:pPr>
+        <w:pStyle w:val="ListBullet"/>
+      </w:pPr>
+      <w:r/>
+      <w:r>
+        <w:rPr>
+          <w:b/>
+        </w:rPr>
+        <w:t>R9TR70w88cr</w:t>
+      </w:r>
+      <w:r>
+        <w:t xml:space="preserve"> (Samsung  Galaxy Tab A7 SM-T500) - Last known in Room: Toddlers Two</w:t>
+      </w:r>
+    </w:p>
+    <w:p>
+      <w:pPr>
+        <w:pStyle w:val="ListBullet"/>
+      </w:pPr>
+      <w:r/>
+      <w:r>
+        <w:rPr>
+          <w:b/>
+        </w:rPr>
+        <w:t>GV3XHHC4CH</w:t>
+      </w:r>
+      <w:r>
+        <w:t xml:space="preserve"> (Apple 9th Gen MK2K3X/A) - Last known in Room: Toddlers One</w:t>
+      </w:r>
+    </w:p>
+    <w:p>
+      <w:pPr>
+        <w:pStyle w:val="ListBullet"/>
+      </w:pPr>
+      <w:r/>
+      <w:r>
+        <w:rPr>
+          <w:b/>
+        </w:rPr>
+        <w:t>R9YT10FE&lt;VJ</w:t>
+      </w:r>
+      <w:r>
+        <w:t xml:space="preserve"> (Samsung  Galaxy Tab A8 SM-X200) - Last known in Room: Kitchen</w:t>
+      </w:r>
+    </w:p>
+    <w:p>
+      <w:pPr>
+        <w:pStyle w:val="ListBullet"/>
+      </w:pPr>
+      <w:r/>
+      <w:r>
+        <w:rPr>
+          <w:b/>
+        </w:rPr>
+        <w:t>R9TR70W810E</w:t>
+      </w:r>
+      <w:r>
+        <w:t xml:space="preserve"> (Samsung  Galaxy Tab A7 SM-T500) - Last known in Room: Kindy Two</w:t>
+      </w:r>
+    </w:p>
+    <w:p>
+      <w:pPr>
+        <w:pStyle w:val="ListBullet"/>
+      </w:pPr>
+      <w:r/>
+      <w:r>
+        <w:rPr>
+          <w:b/>
+        </w:rPr>
+        <w:t>F69YR6WW0L</w:t>
+      </w:r>
+      <w:r>
+        <w:t xml:space="preserve"> (Apple A16) - Last known in Room: BELC Gym Music</w:t>
+      </w:r>
+    </w:p>
+    <w:p>
+      <w:pPr>
+        <w:pStyle w:val="ListBullet"/>
+      </w:pPr>
+      <w:r/>
+      <w:r>
+        <w:rPr>
+          <w:b/>
+        </w:rPr>
+        <w:t>R9TR80A8TBB</w:t>
+      </w:r>
+      <w:r>
+        <w:t xml:space="preserve"> (Samsung  Galaxy Tab A7 SM-T500) - Last known in Room: Babies Two</w:t>
+      </w:r>
+    </w:p>
+    <w:p>
+      <w:pPr>
+        <w:pStyle w:val="ListBullet"/>
+      </w:pPr>
+      <w:r/>
+      <w:r>
+        <w:rPr>
+          <w:b/>
+        </w:rPr>
+        <w:t>MW454V2HDH</w:t>
+      </w:r>
+      <w:r>
+        <w:t xml:space="preserve"> (Apple 9th Gen MK2K3X/A) - Last known in Room: Xplor Signin OSHC</w:t>
+      </w:r>
+    </w:p>
+    <w:p>
+      <w:pPr>
+        <w:pStyle w:val="ListBullet"/>
+      </w:pPr>
+      <w:r/>
+      <w:r>
+        <w:rPr>
+          <w:b/>
+        </w:rPr>
+        <w:t>DDP2QXF6H9</w:t>
+      </w:r>
+      <w:r>
+        <w:t xml:space="preserve"> (Iphone 14 Pro Max) - Last known in Room: Simona</w:t>
+      </w:r>
+    </w:p>
+    <w:p>
+      <w:pPr>
+        <w:pStyle w:val="ListBullet"/>
+      </w:pPr>
+      <w:r/>
+      <w:r>
+        <w:rPr>
+          <w:b/>
+        </w:rPr>
+        <w:t>JD9JqDPX4L</w:t>
+      </w:r>
+      <w:r>
+        <w:t xml:space="preserve"> (Iphone 15 MTP03ZP/A) - Last known in Room: Russell</w:t>
+      </w:r>
+    </w:p>
+    <w:p>
+      <w:pPr>
+        <w:pStyle w:val="ListBullet"/>
+      </w:pPr>
+      <w:r/>
+      <w:r>
+        <w:rPr>
+          <w:b/>
+        </w:rPr>
+        <w:t>TV39PR9WI9</w:t>
+      </w:r>
+      <w:r>
+        <w:t xml:space="preserve"> (IPhone 14 Pro Max) - Last known in Room: Kylie</w:t>
+      </w:r>
+    </w:p>
+    <w:p>
+      <w:pPr>
+        <w:pStyle w:val="ListBullet"/>
+      </w:pPr>
+      <w:r/>
+      <w:r>
+        <w:rPr>
+          <w:b/>
+        </w:rPr>
+        <w:t>LF2LRW53QW</w:t>
+      </w:r>
+      <w:r>
+        <w:t xml:space="preserve"> (Iphone 13 MLPF3X/A) - Last known in Room: Kate</w:t>
       </w:r>
     </w:p>
     <w:sectPr>

</xml_diff>